<commit_message>
Actualizar documentación, dashboard y correcciones en  archivos de Power BI
</commit_message>
<xml_diff>
--- a/docs/RetailIQ360_Final_06-05-2026.docx
+++ b/docs/RetailIQ360_Final_06-05-2026.docx
@@ -159,17 +159,7 @@
           <w:szCs w:val="28"/>
           <w:lang w:val="es-ES"/>
         </w:rPr>
-        <w:t xml:space="preserve"> 360°</w:t>
-      </w:r>
-      <w:r>
-        <w:rPr>
-          <w:b/>
-          <w:bCs/>
-          <w:sz w:val="28"/>
-          <w:szCs w:val="28"/>
-          <w:lang w:val="es-ES"/>
-        </w:rPr>
-        <w:t xml:space="preserve">: </w:t>
+        <w:t xml:space="preserve"> 360°: </w:t>
       </w:r>
       <w:r>
         <w:rPr>
@@ -483,7 +473,11 @@
     <w:sdt>
       <w:sdtPr>
         <w:rPr>
-          <w:lang w:val="es-ES"/>
+          <w:rFonts w:ascii="Arial" w:eastAsia="Arial" w:hAnsi="Arial" w:cs="Arial"/>
+          <w:color w:val="auto"/>
+          <w:sz w:val="22"/>
+          <w:szCs w:val="22"/>
+          <w:lang w:val="es-ES" w:eastAsia="es-AR"/>
         </w:rPr>
         <w:id w:val="-609508828"/>
         <w:docPartObj>
@@ -493,13 +487,8 @@
       </w:sdtPr>
       <w:sdtEndPr>
         <w:rPr>
-          <w:rFonts w:ascii="Arial" w:eastAsia="Arial" w:hAnsi="Arial" w:cs="Arial"/>
           <w:b/>
           <w:bCs/>
-          <w:color w:val="auto"/>
-          <w:sz w:val="22"/>
-          <w:szCs w:val="22"/>
-          <w:lang w:eastAsia="es-AR"/>
         </w:rPr>
       </w:sdtEndPr>
       <w:sdtContent>
@@ -5385,9 +5374,6 @@
     <w:p/>
     <w:p>
       <w:r>
-        <w:rPr>
-          <w:lang w:val="en-US"/>
-        </w:rPr>
         <w:t xml:space="preserve">Statista (2026). E-commerce B2C revenue in Argentina. </w:t>
       </w:r>
       <w:r>
@@ -5469,7 +5455,7 @@
 <w:hdr xmlns:wpc="http://schemas.microsoft.com/office/word/2010/wordprocessingCanvas" xmlns:cx="http://schemas.microsoft.com/office/drawing/2014/chartex" xmlns:cx1="http://schemas.microsoft.com/office/drawing/2015/9/8/chartex" xmlns:cx2="http://schemas.microsoft.com/office/drawing/2015/10/21/chartex" xmlns:cx3="http://schemas.microsoft.com/office/drawing/2016/5/9/chartex" xmlns:cx4="http://schemas.microsoft.com/office/drawing/2016/5/10/chartex" xmlns:cx5="http://schemas.microsoft.com/office/drawing/2016/5/11/chartex" xmlns:cx6="http://schemas.microsoft.com/office/drawing/2016/5/12/chartex" xmlns:cx7="http://schemas.microsoft.com/office/drawing/2016/5/13/chartex" xmlns:cx8="http://schemas.microsoft.com/office/drawing/2016/5/14/chartex" xmlns:mc="http://schemas.openxmlformats.org/markup-compatibility/2006" xmlns:aink="http://schemas.microsoft.com/office/drawing/2016/ink" xmlns:am3d="http://schemas.microsoft.com/office/drawing/2017/model3d" xmlns:o="urn:schemas-microsoft-com:office:office" xmlns:oel="http://schemas.microsoft.com/office/2019/extlst" xmlns:r="http://schemas.openxmlformats.org/officeDocument/2006/relationships" xmlns:m="http://schemas.openxmlformats.org/officeDocument/2006/math" xmlns:v="urn:schemas-microsoft-com:vml" xmlns:wp14="http://schemas.microsoft.com/office/word/2010/wordprocessingDrawing" xmlns:wp="http://schemas.openxmlformats.org/drawingml/2006/wordprocessingDrawing" xmlns:w10="urn:schemas-microsoft-com:office:word" xmlns:w="http://schemas.openxmlformats.org/wordprocessingml/2006/main" xmlns:w14="http://schemas.microsoft.com/office/word/2010/wordml" xmlns:w15="http://schemas.microsoft.com/office/word/2012/wordml" xmlns:w16cex="http://schemas.microsoft.com/office/word/2018/wordml/cex" xmlns:w16cid="http://schemas.microsoft.com/office/word/2016/wordml/cid" xmlns:w16="http://schemas.microsoft.com/office/word/2018/wordml" xmlns:w16du="http://schemas.microsoft.com/office/word/2023/wordml/word16du" xmlns:w16sdtdh="http://schemas.microsoft.com/office/word/2020/wordml/sdtdatahash" xmlns:w16sdtfl="http://schemas.microsoft.com/office/word/2024/wordml/sdtformatlock" xmlns:w16se="http://schemas.microsoft.com/office/word/2015/wordml/symex" xmlns:wpg="http://schemas.microsoft.com/office/word/2010/wordprocessingGroup" xmlns:wpi="http://schemas.microsoft.com/office/word/2010/wordprocessingInk" xmlns:wne="http://schemas.microsoft.com/office/word/2006/wordml" xmlns:wps="http://schemas.microsoft.com/office/word/2010/wordprocessingShape" mc:Ignorable="w14 w15 w16se w16cid w16 w16cex w16sdtdh w16sdtfl w16du wp14">
   <w:sdt>
     <w:sdtPr>
-      <w:id w:val="-153454044"/>
+      <w:id w:val="-461735096"/>
       <w:docPartObj>
         <w:docPartGallery w:val="Page Numbers (Top of Page)"/>
         <w:docPartUnique/>
@@ -5479,6 +5465,7 @@
       <w:p>
         <w:pPr>
           <w:pStyle w:val="Encabezado"/>
+          <w:jc w:val="right"/>
         </w:pPr>
         <w:r>
           <w:fldChar w:fldCharType="begin"/>
@@ -6160,6 +6147,7 @@
   <w:style w:type="character" w:default="1" w:styleId="Fuentedeprrafopredeter">
     <w:name w:val="Default Paragraph Font"/>
     <w:uiPriority w:val="1"/>
+    <w:semiHidden/>
     <w:unhideWhenUsed/>
   </w:style>
   <w:style w:type="table" w:default="1" w:styleId="Tablanormal">

</xml_diff>